<commit_message>
docs: pasar informe individual a primera persona
</commit_message>
<xml_diff>
--- a/docs/Tarnoski Santiago_Informe Individual_Actividad Evaluativa 2.docx
+++ b/docs/Tarnoski Santiago_Informe Individual_Actividad Evaluativa 2.docx
@@ -194,7 +194,7 @@
         <w:jc w:val="both"/>
       </w:pPr>
       <w:r>
-        <w:t>La tarjeta asignada es la opción 3, Buscador y filtro de catálogo en tiempo real. Exige registrar los eventos con addEventListener, cargar el catálogo completo mediante fetch y async/await, filtrar los datos en memoria con Array.filter y presentar los resultados en el DOM. La fundamentación de la Unidad 1 corresponde a SOHDM, aplicada al escenario de exploración y búsqueda.</w:t>
+        <w:t>Desarrollé la tarjeta 3, Buscador y filtro de catálogo en tiempo real. Registré los eventos con addEventListener, cargué el catálogo mediante fetch y async/await, filtré los datos en memoria con Array.filter y actualicé el DOM con los resultados. Para fundamentar mi aporte, apliqué SOHDM al escenario de exploración y búsqueda.</w:t>
       </w:r>
     </w:p>
     <w:p>
@@ -203,7 +203,7 @@
         <w:jc w:val="both"/>
       </w:pPr>
       <w:r>
-        <w:t>Este informe individual documenta el aporte de Santiago Tarnoski: la implementación de la tarjeta 3, su fundamentación con SOHDM, las decisiones técnicas y las evidencias de verificación. Complementa el informe grupal, que reúne las tres tarjetas del equipo. El alcance es académico: los datos son de ejemplo, no hay persistencia ni contratación real.</w:t>
+        <w:t>Presento mi aporte individual a la tarjeta 3, su fundamentación con SOHDM, las decisiones técnicas que tomé y las evidencias que reuní. Complementa el informe grupal, en el que documentamos las tres tarjetas del equipo. El alcance es académico: los datos son de ejemplo, no hay persistencia ni contratación real.</w:t>
       </w:r>
     </w:p>
     <w:p>
@@ -220,7 +220,7 @@
         <w:jc w:val="both"/>
       </w:pPr>
       <w:r>
-        <w:t>La responsabilidad asignada a Santiago Tarnoski corresponde al buscador y filtro del catálogo. Comprende la carga del JSON, el registro de eventos, el filtrado, la presentación de resultados, los estados de la interfaz y la navegación al formulario con el plan elegido. La fundamentación incluye el escenario E01 y su mapa navegacional SOHDM.</w:t>
+        <w:t>Me hice cargo del buscador y filtro del catálogo: cargué el JSON, registré los eventos, filtré los planes, presenté los resultados y conecté la selección con el formulario. También elaboré el escenario E01 y su mapa navegacional con SOHDM.</w:t>
       </w:r>
     </w:p>
     <w:p>
@@ -229,7 +229,7 @@
         <w:jc w:val="both"/>
       </w:pPr>
       <w:r>
-        <w:t>El informe grupal identifica a Franco Olexyn como responsable de la tarjeta 4, registro y autenticación de socios con VSDM, y a Santino Martins como responsable de la tarjeta 11, reclamos y consultas con fundamentación conceptual de RNA. Esos módulos forman parte del contexto de integración; este informe desarrolla y evalúa específicamente la tarjeta 3.</w:t>
+        <w:t>Mis compañeros Franco Olexyn y Santino Martins desarrollaron, respectivamente, la tarjeta 4 de acceso de socios con VSDM y la tarjeta 11 de reclamos y consultas con una fundamentación conceptual de RNA. En este informe describo mi aporte, la tarjeta 3, y explico cómo se integra con los módulos de ellos.</w:t>
       </w:r>
     </w:p>
     <w:p>
@@ -505,7 +505,7 @@
         <w:jc w:val="both"/>
       </w:pPr>
       <w:r>
-        <w:t>El usuario accede a listado_box.html desde la portada o desde el listado en tabla. Antes de ofrecer la búsqueda, js/app.js consulta por HTTP el archivo data/planes.json. Cada registro describe el identificador, nombre, duración, precio, categoría, descripción y marca de destacado de un plan. Los precios se conservan del proyecto original: Mensual $25.000, Trimestral $67.500, Semestral $120.000 y Anual $216.000.</w:t>
+        <w:t>Incorporé el módulo en listado_box.html, accesible desde la portada y desde el listado en tabla. Al iniciar la página, mi código consulta por HTTP data/planes.json antes de mostrar la búsqueda. Cada registro contiene el identificador, nombre, duración, precio, categoría, descripción y marca de destacado. Conservé los precios del proyecto original: Mensual $25.000, Trimestral $67.500, Semestral $120.000 y Anual $216.000.</w:t>
       </w:r>
     </w:p>
     <w:p>
@@ -514,7 +514,7 @@
         <w:jc w:val="both"/>
       </w:pPr>
       <w:r>
-        <w:t>El campo de texto busca coincidencias en nombre, descripción y categoría. La selección de duración admite 1, 3, 6 y 12 meses. Ambos criterios se aplican en conjunto. El usuario puede cambiar el texto sin pulsar un botón, limpiar los filtros o elegir un resultado. Por ejemplo, escribir renovacion encuentra renovación sin exigir la tilde. El término mensual devuelve también el Plan Anual porque su descripción menciona valor mensual.</w:t>
+        <w:t>Implementé un campo de texto que busca en el nombre, la descripción y la categoría, junto con un selector de 1, 3, 6 o 12 meses. Combiné ambos criterios para que la lista se actualice al cambiar cualquiera de ellos. También incorporé la limpieza de filtros y la selección del plan. Comprobé que renovacion encuentra renovación sin tilde y que mensual también coincide con el Plan Anual por la frase valor mensual de su descripción.</w:t>
       </w:r>
     </w:p>
     <w:p>
@@ -774,7 +774,7 @@
         <w:jc w:val="both"/>
       </w:pPr>
       <w:r>
-        <w:t>La carga usa fetch("data/planes.json") con await. El programa verifica response.ok y valida el formato antes de habilitar los filtros. Un error HTTP, de red o de datos muestra un mensaje y un botón Reintentar. El catálogo vacío tiene un mensaje diferente del caso sin coincidencias. Al modificar los criterios, el programa aplica Array.filter sobre los registros ya cargados, sin realizar otra petición [2, 3].</w:t>
+        <w:t>Implementé la carga con fetch("data/planes.json") y await. Verifico response.ok y valido el formato antes de habilitar los filtros. Si se produce un error HTTP, de red o de datos, muestro un mensaje y el botón Reintentar. Diferencio un catálogo vacío de una búsqueda sin coincidencias. Cuando cambian los criterios, aplico Array.filter sobre los registros cargados y evito repetir la petición [2, 3].</w:t>
       </w:r>
     </w:p>
     <w:p>
@@ -783,7 +783,7 @@
         <w:jc w:val="both"/>
       </w:pPr>
       <w:r>
-        <w:t>Las tarjetas se construyen con createElement y textContent, y se insertan con replaceChildren. Esta decisión permite presentar el contenido JSON como texto. Los archivos originales js/subtotal.js y js/cupon.js no se modificaron; al seguir un resultado, un parámetro plan preselecciona el radio correspondiente y dispara su evento change para actualizar el subtotal existente.</w:t>
+        <w:t>Construyo las tarjetas con createElement y textContent y las inserto con replaceChildren, para tratar el contenido JSON como texto. Integré la selección mediante el parámetro plan: al abrir el formulario, mi cambio preselecciona el radio del plan y dispara su evento change para actualizar el subtotal. Conservé la compatibilidad con las funciones existentes de subtotal y cupón.</w:t>
       </w:r>
     </w:p>
     <w:p>
@@ -1359,7 +1359,7 @@
         <w:jc w:val="both"/>
       </w:pPr>
       <w:r>
-        <w:t>Plan aporta los atributos que se buscan y presentan. Consulta representa el texto normalizado y la duración. Catálogo contiene los planes cargados y obtiene las coincidencias. Las vistas muestran únicamente la información necesaria para explorar y decidir. La aplicación usa registros JSON y funciones JavaScript; no implementa un motor formal de SOHDM.</w:t>
+        <w:t>Modelé Plan como el objeto con los atributos que busco y presento, Consulta como el texto normalizado y la duración, y Catálogo como el conjunto cargado y filtrado. En las vistas mostré la información necesaria para explorar y decidir. Apliqué las ideas de SOHDM al diseño; no implementé un motor formal de esa metodología.</w:t>
       </w:r>
     </w:p>
     <w:p>
@@ -1376,7 +1376,7 @@
         <w:jc w:val="both"/>
       </w:pPr>
       <w:r>
-        <w:t>El mapa deriva del escenario E01. La navegación existente Inicio → Listado en tabla o Catálogo en tarjetas se mantiene. Búsqueda y resultados son estados de la página listado_box.html, no páginas independientes. Desde una tarjeta, el usuario puede ir a la selección con el ID del plan. La ficha producto.html del proyecto previo corresponde específicamente al Plan Mensual.</w:t>
+        <w:t>Derivé el mapa navegacional del escenario E01. Conservé el recorrido Inicio → Listado en tabla o Catálogo en tarjetas. Representé búsqueda y resultados como estados de listado_box.html y no como páginas independientes. Desde cada tarjeta, el usuario puede continuar a la selección mediante el ID del plan. Mantuve la ficha producto.html para el Plan Mensual.</w:t>
       </w:r>
     </w:p>
     <w:p>
@@ -1436,7 +1436,7 @@
         <w:jc w:val="both"/>
       </w:pPr>
       <w:r>
-        <w:t>Los enlaces de retorno permiten revisar la tabla, modificar filtros o limpiar la consulta. Si falla la carga, Reintentar vuelve a ejecutar la petición HTTP sobre el mismo nodo. El archivo editable docs/mapa-navegacional-tarjeta3.mmd conserva el diagrama.</w:t>
+        <w:t>Incorporé enlaces para volver a la tabla, cambiar los filtros o limpiar la consulta. Si falla la carga, el botón Reintentar vuelve a ejecutar la petición desde el mismo nodo. Guardé el diagrama editable en docs/mapa-navegacional-tarjeta3.mmd.</w:t>
       </w:r>
     </w:p>
     <w:p>
@@ -1453,7 +1453,7 @@
         <w:jc w:val="both"/>
       </w:pPr>
       <w:r>
-        <w:t>El evento input del campo de búsqueda y change del selector de duración llaman a filtrarPlanes(). El botón Limpiar filtros restaura ambos controles y devuelve el foco al campo de texto. El botón Reintentar invoca cargarCatalogo(). Todos se vinculan mediante addEventListener en js/app.js; el HTML no contiene atributos onclick ni onsubmit [4].</w:t>
+        <w:t>Vinculé input del campo de búsqueda y change del selector de duración con filtrarPlanes(). Configuré Limpiar filtros para restaurar los controles y devolver el foco al texto; Reintentar vuelve a llamar a cargarCatalogo(). Registré estos eventos con addEventListener en js/app.js y evité los atributos onclick y onsubmit en el HTML [4].</w:t>
       </w:r>
     </w:p>
     <w:p>
@@ -1462,7 +1462,7 @@
         <w:jc w:val="both"/>
       </w:pPr>
       <w:r>
-        <w:t>El contador informa cuántos planes se muestran de los cuatro disponibles. role="status" y aria-live="polite" comunican los resultados; aria-busy indica la carga. Mientras la respuesta no es válida, los controles permanecen deshabilitados. El CSS reorganiza los controles y las tarjetas en una columna para teléfonos.</w:t>
+        <w:t>Agregué un contador para informar cuántos planes se muestran de los cuatro disponibles. Usé role="status" y aria-live="polite" para comunicar resultados, y aria-busy para señalar la carga. Mantengo los controles deshabilitados mientras la respuesta no sea válida. Adapté los controles y las tarjetas a una columna en teléfonos.</w:t>
       </w:r>
     </w:p>
     <w:p>
@@ -1479,7 +1479,7 @@
         <w:jc w:val="both"/>
       </w:pPr>
       <w:r>
-        <w:t>Se ejecutaron 36 comprobaciones en Google Chrome mediante un servidor HTTP local. El registro completo se conserva en docs/pruebas-tarjeta3.json y el procedimiento reproducible en tests/catalogo.cjs. Las pruebas cubren la carga de las cuatro tarjetas, búsquedas con tildes y mayúsculas, combinación de filtros, cero resultados, limpieza, selección de plan, compatibilidad con subtotal y cupón, vista móvil y fallos HTTP, de red o de JSON.</w:t>
+        <w:t>Ejecuté 36 comprobaciones en Google Chrome con un servidor HTTP local. Dejé el registro en docs/pruebas-tarjeta3.json y el procedimiento reproducible en tests/catalogo.cjs. Comprobé la carga de las cuatro tarjetas, búsquedas con tildes y mayúsculas, filtros combinados, cero resultados, limpieza, selección de plan, compatibilidad con subtotal y cupón, vista móvil y errores HTTP, de red o de JSON.</w:t>
       </w:r>
     </w:p>
     <w:tbl>
@@ -1731,7 +1731,7 @@
         <w:jc w:val="both"/>
       </w:pPr>
       <w:r>
-        <w:t>El resultado global fue de 36 verificaciones correctas. El contenido del JSON se insertó como texto, y el recorrido normal no produjo errores JavaScript. Las capturas de pantalla se incluyen en Anexos.</w:t>
+        <w:t>Obtuve 36 verificaciones correctas. Comprobé que el JSON se inserte como texto y que el recorrido normal no produzca errores JavaScript. Incluí las capturas de pantalla en los anexos.</w:t>
       </w:r>
     </w:p>
     <w:p>
@@ -1748,7 +1748,7 @@
         <w:jc w:val="both"/>
       </w:pPr>
       <w:r>
-        <w:t>Una decisión central fue separar la carga del catálogo de la búsqueda. La petición HTTP ocurre al iniciar la página o al reintentar una carga fallida; cada cambio de texto o duración utiliza el arreglo que ya está en memoria. Esto evita peticiones repetidas y permite actualizar los resultados inmediatamente.</w:t>
+        <w:t>Decidí separar la carga del catálogo de la búsqueda. Hago la petición HTTP al iniciar la página o al reintentar una carga fallida; cada cambio de texto o duración usa el arreglo que ya está en memoria. Así evito peticiones repetidas y actualizo los resultados inmediatamente.</w:t>
       </w:r>
     </w:p>
     <w:p>
@@ -1757,7 +1757,7 @@
         <w:jc w:val="both"/>
       </w:pPr>
       <w:r>
-        <w:t>El resultado se conserva al navegar mediante el identificador del plan en la URL. Esa integración aprovecha el formulario existente y su cálculo de subtotal. Los estados de carga, error, catálogo vacío y ausencia de coincidencias se distinguen para orientar al usuario y evitar que filtre datos que todavía no están disponibles.</w:t>
+        <w:t>Conservé la selección al navegar mediante el identificador del plan en la URL. Integré ese recorrido con el formulario existente y su cálculo de subtotal. Distinguí los estados de carga, error, catálogo vacío y ausencia de coincidencias para orientar al usuario y evitar que filtre datos que todavía no están disponibles.</w:t>
       </w:r>
     </w:p>
     <w:p>
@@ -1775,7 +1775,7 @@
         <w:jc w:val="both"/>
       </w:pPr>
       <w:r>
-        <w:t>La actividad vincula los requisitos del escenario con los eventos y estados concretos de una página web. Los principales conceptos aplicados en este aporte son asincronía, validación de una respuesta HTTP, operaciones sobre arreglos y actualización del DOM. Como mejora futura, el catálogo podría consumirse desde un servicio con persistencia; esa ampliación requeriría revisar el contrato de datos y sus rutas de error.</w:t>
+        <w:t>En mi trabajo relacioné los requisitos del escenario con eventos y estados concretos de una página web. Apliqué asincronía, validación de respuestas HTTP, operaciones sobre arreglos y actualización del DOM. Como mejora futura, propongo conectar el catálogo con un servicio persistente y revisar el contrato de datos y sus rutas de error.</w:t>
       </w:r>
     </w:p>
     <w:p>
@@ -1797,7 +1797,7 @@
         <w:jc w:val="both"/>
       </w:pPr>
       <w:r>
-        <w:t>El aporte individual de Santiago Tarnoski incorpora a Gym Control el módulo de la tarjeta 3, distinto del subtotal, del cupón y de las tarjetas 4 y 11 del equipo. Cumple la tarjeta 3 mediante eventos desacoplados, una carga HTTP asíncrona del catálogo, filtrado de Array.filter en memoria y actualización inmediata del DOM.</w:t>
+        <w:t>En esta Actividad Evaluativa 2 incorporé a Gym Control el buscador y filtro de la tarjeta 3, complementario al subtotal y la validación del cupón desarrollados previamente. Cumplí la tarjeta 3 al registrar eventos desacoplados, cargar el catálogo de forma asíncrona mediante HTTP, filtrar los datos con Array.filter en memoria y actualizar el DOM de inmediato.</w:t>
       </w:r>
     </w:p>
     <w:p>
@@ -1806,7 +1806,7 @@
         <w:jc w:val="both"/>
       </w:pPr>
       <w:r>
-        <w:t>El escenario E01 permitió justificar los campos de consulta, los estados de resultados y los accesos entre catálogo y formulario. El mapa navegacional SOHDM relaciona esa interacción con las pantallas existentes y conserva la continuidad del proyecto. Las pruebas confirman los casos esperados y las rutas de error del prototipo.</w:t>
+        <w:t>A partir del escenario E01 definí los campos de consulta, los estados de resultados y los accesos entre el catálogo y el formulario. Diseñé el mapa navegacional SOHDM para relacionar esa interacción con las pantallas existentes y dar continuidad al proyecto. Con las pruebas comprobé los casos esperados y las rutas de error del prototipo.</w:t>
       </w:r>
     </w:p>
     <w:p>
@@ -1815,7 +1815,7 @@
         <w:jc w:val="both"/>
       </w:pPr>
       <w:r>
-        <w:t>El catálogo JSON conserva datos comerciales de ejemplo. Para operar membresías reales sería necesario un servicio de servidor, persistencia y validación de las operaciones. Esta entrega se limita a la consulta, exploración y selección visual de planes.</w:t>
+        <w:t>Dejé en el catálogo JSON datos comerciales de ejemplo. Para operar membresías reales, propongo incorporar un servicio de servidor, persistencia y validación de las operaciones. Mi entrega cubre la consulta, exploración y selección visual de planes.</w:t>
       </w:r>
     </w:p>
     <w:p>

</xml_diff>